<commit_message>
feat: complete 16-paper literature survey
</commit_message>
<xml_diff>
--- a/heart-disease-prediction/reports/Heart_Disease_Capstone_Final_Report.docx
+++ b/heart-disease-prediction/reports/Heart_Disease_Capstone_Final_Report.docx
@@ -2450,6 +2450,2893 @@
           <w:sz w:val="19"/>
         </w:rPr>
         <w:t>Figure 1: Binary Target Class Distribution (UCI Cleveland Dataset)</w:t>
+      </w:r>
+    </w:p>
+    <w:p>
+      <w:pPr>
+        <w:keepNext/>
+        <w:spacing w:before="280" w:after="120"/>
+      </w:pPr>
+      <w:r>
+        <w:rPr>
+          <w:rFonts w:ascii="Arial" w:hAnsi="Arial"/>
+          <w:b/>
+          <w:color w:val="1B365D"/>
+          <w:sz w:val="32"/>
+        </w:rPr>
+        <w:t>3. Comprehensive Literature Survey &amp; Related Work</w:t>
+      </w:r>
+    </w:p>
+    <w:p>
+      <w:pPr>
+        <w:spacing w:before="0" w:after="120" w:line="276" w:lineRule="auto"/>
+      </w:pPr>
+      <w:r>
+        <w:rPr>
+          <w:rFonts w:ascii="Calibri" w:hAnsi="Calibri"/>
+          <w:sz w:val="22"/>
+        </w:rPr>
+        <w:t>A rigorous literature survey of 16 peer-reviewed academic publications (8 Machine Learning papers and 8 Deep Learning papers) was conducted to evaluate existing methodology, dataset usage, algorithmic approaches, and diagnostic performance in cardiovascular risk prediction.</w:t>
+      </w:r>
+    </w:p>
+    <w:p>
+      <w:pPr>
+        <w:keepNext/>
+        <w:spacing w:before="200" w:after="80"/>
+      </w:pPr>
+      <w:r>
+        <w:rPr>
+          <w:rFonts w:ascii="Arial" w:hAnsi="Arial"/>
+          <w:b/>
+          <w:color w:val="4B6B94"/>
+          <w:sz w:val="26"/>
+        </w:rPr>
+        <w:t>3.1 Machine Learning Literature (8 Papers)</w:t>
+      </w:r>
+    </w:p>
+    <w:p>
+      <w:pPr>
+        <w:spacing w:before="0" w:after="120" w:line="276" w:lineRule="auto"/>
+      </w:pPr>
+      <w:r>
+        <w:rPr>
+          <w:rFonts w:ascii="Calibri" w:hAnsi="Calibri"/>
+          <w:sz w:val="22"/>
+        </w:rPr>
+        <w:t>Machine learning studies in heart disease prediction have primarily leveraged decision tree ensembles, support vector machines, and fuzzy decision systems on clinical tabular attributes.</w:t>
+      </w:r>
+    </w:p>
+    <w:tbl>
+      <w:tblPr>
+        <w:tblW w:type="auto" w:w="0"/>
+        <w:jc w:val="center"/>
+        <w:tblLook w:firstColumn="1" w:firstRow="1" w:lastColumn="0" w:lastRow="0" w:noHBand="0" w:noVBand="1" w:val="04A0"/>
+      </w:tblPr>
+      <w:tblGrid>
+        <w:gridCol w:w="1337"/>
+        <w:gridCol w:w="1337"/>
+        <w:gridCol w:w="1337"/>
+        <w:gridCol w:w="1337"/>
+        <w:gridCol w:w="1337"/>
+        <w:gridCol w:w="1337"/>
+        <w:gridCol w:w="1337"/>
+      </w:tblGrid>
+      <w:tr>
+        <w:tc>
+          <w:tcPr>
+            <w:tcW w:type="dxa" w:w="720"/>
+            <w:shd w:fill="1B365D"/>
+          </w:tcPr>
+          <w:p>
+            <w:pPr>
+              <w:jc w:val="center"/>
+            </w:pPr>
+            <w:r>
+              <w:rPr>
+                <w:rFonts w:ascii="Arial" w:hAnsi="Arial"/>
+                <w:b/>
+                <w:color w:val="FFFFFF"/>
+                <w:sz w:val="19"/>
+              </w:rPr>
+              <w:t>Sl No</w:t>
+            </w:r>
+          </w:p>
+        </w:tc>
+        <w:tc>
+          <w:tcPr>
+            <w:tcW w:type="dxa" w:w="1728"/>
+            <w:shd w:fill="1B365D"/>
+          </w:tcPr>
+          <w:p>
+            <w:pPr>
+              <w:jc w:val="center"/>
+            </w:pPr>
+            <w:r>
+              <w:rPr>
+                <w:rFonts w:ascii="Arial" w:hAnsi="Arial"/>
+                <w:b/>
+                <w:color w:val="FFFFFF"/>
+                <w:sz w:val="19"/>
+              </w:rPr>
+              <w:t>Author/Year</w:t>
+            </w:r>
+          </w:p>
+        </w:tc>
+        <w:tc>
+          <w:tcPr>
+            <w:tcW w:type="dxa" w:w="3168"/>
+            <w:shd w:fill="1B365D"/>
+          </w:tcPr>
+          <w:p>
+            <w:pPr>
+              <w:jc w:val="center"/>
+            </w:pPr>
+            <w:r>
+              <w:rPr>
+                <w:rFonts w:ascii="Arial" w:hAnsi="Arial"/>
+                <w:b/>
+                <w:color w:val="FFFFFF"/>
+                <w:sz w:val="19"/>
+              </w:rPr>
+              <w:t>Paper Title</w:t>
+            </w:r>
+          </w:p>
+        </w:tc>
+        <w:tc>
+          <w:tcPr>
+            <w:tcW w:type="dxa" w:w="1872"/>
+            <w:shd w:fill="1B365D"/>
+          </w:tcPr>
+          <w:p>
+            <w:pPr>
+              <w:jc w:val="center"/>
+            </w:pPr>
+            <w:r>
+              <w:rPr>
+                <w:rFonts w:ascii="Arial" w:hAnsi="Arial"/>
+                <w:b/>
+                <w:color w:val="FFFFFF"/>
+                <w:sz w:val="19"/>
+              </w:rPr>
+              <w:t>Journal / Publisher</w:t>
+            </w:r>
+          </w:p>
+        </w:tc>
+        <w:tc>
+          <w:tcPr>
+            <w:tcW w:type="dxa" w:w="2016"/>
+            <w:shd w:fill="1B365D"/>
+          </w:tcPr>
+          <w:p>
+            <w:pPr>
+              <w:jc w:val="center"/>
+            </w:pPr>
+            <w:r>
+              <w:rPr>
+                <w:rFonts w:ascii="Arial" w:hAnsi="Arial"/>
+                <w:b/>
+                <w:color w:val="FFFFFF"/>
+                <w:sz w:val="19"/>
+              </w:rPr>
+              <w:t>Main Method</w:t>
+            </w:r>
+          </w:p>
+        </w:tc>
+        <w:tc>
+          <w:tcPr>
+            <w:tcW w:type="dxa" w:w="1296"/>
+            <w:shd w:fill="1B365D"/>
+          </w:tcPr>
+          <w:p>
+            <w:pPr>
+              <w:jc w:val="center"/>
+            </w:pPr>
+            <w:r>
+              <w:rPr>
+                <w:rFonts w:ascii="Arial" w:hAnsi="Arial"/>
+                <w:b/>
+                <w:color w:val="FFFFFF"/>
+                <w:sz w:val="19"/>
+              </w:rPr>
+              <w:t>Dataset</w:t>
+            </w:r>
+          </w:p>
+        </w:tc>
+        <w:tc>
+          <w:tcPr>
+            <w:tcW w:type="dxa" w:w="1152"/>
+            <w:shd w:fill="1B365D"/>
+          </w:tcPr>
+          <w:p>
+            <w:pPr>
+              <w:jc w:val="center"/>
+            </w:pPr>
+            <w:r>
+              <w:rPr>
+                <w:rFonts w:ascii="Arial" w:hAnsi="Arial"/>
+                <w:b/>
+                <w:color w:val="FFFFFF"/>
+                <w:sz w:val="19"/>
+              </w:rPr>
+              <w:t>Team Member</w:t>
+            </w:r>
+          </w:p>
+        </w:tc>
+      </w:tr>
+      <w:tr>
+        <w:tc>
+          <w:tcPr>
+            <w:tcW w:type="dxa" w:w="720"/>
+            <w:shd w:fill="FFFFFF"/>
+          </w:tcPr>
+          <w:p>
+            <w:pPr>
+              <w:spacing w:after="40" w:before="40"/>
+            </w:pPr>
+            <w:r>
+              <w:rPr>
+                <w:rFonts w:ascii="Calibri" w:hAnsi="Calibri"/>
+                <w:sz w:val="19"/>
+              </w:rPr>
+              <w:t>1</w:t>
+            </w:r>
+          </w:p>
+        </w:tc>
+        <w:tc>
+          <w:tcPr>
+            <w:tcW w:type="dxa" w:w="1728"/>
+            <w:shd w:fill="FFFFFF"/>
+          </w:tcPr>
+          <w:p>
+            <w:pPr>
+              <w:spacing w:after="40" w:before="40"/>
+            </w:pPr>
+            <w:r>
+              <w:rPr>
+                <w:rFonts w:ascii="Calibri" w:hAnsi="Calibri"/>
+                <w:sz w:val="19"/>
+              </w:rPr>
+              <w:t>Detrano et al. (1989)</w:t>
+            </w:r>
+          </w:p>
+        </w:tc>
+        <w:tc>
+          <w:tcPr>
+            <w:tcW w:type="dxa" w:w="3168"/>
+            <w:shd w:fill="FFFFFF"/>
+          </w:tcPr>
+          <w:p>
+            <w:pPr>
+              <w:spacing w:after="40" w:before="40"/>
+            </w:pPr>
+            <w:r>
+              <w:rPr>
+                <w:rFonts w:ascii="Calibri" w:hAnsi="Calibri"/>
+                <w:sz w:val="19"/>
+              </w:rPr>
+              <w:t>International application of a new probability algorithm...</w:t>
+            </w:r>
+          </w:p>
+        </w:tc>
+        <w:tc>
+          <w:tcPr>
+            <w:tcW w:type="dxa" w:w="1872"/>
+            <w:shd w:fill="FFFFFF"/>
+          </w:tcPr>
+          <w:p>
+            <w:pPr>
+              <w:spacing w:after="40" w:before="40"/>
+            </w:pPr>
+            <w:r>
+              <w:rPr>
+                <w:rFonts w:ascii="Calibri" w:hAnsi="Calibri"/>
+                <w:sz w:val="19"/>
+              </w:rPr>
+              <w:t>Am J Cardiol (Elsevier)</w:t>
+            </w:r>
+          </w:p>
+        </w:tc>
+        <w:tc>
+          <w:tcPr>
+            <w:tcW w:type="dxa" w:w="2016"/>
+            <w:shd w:fill="FFFFFF"/>
+          </w:tcPr>
+          <w:p>
+            <w:pPr>
+              <w:spacing w:after="40" w:before="40"/>
+            </w:pPr>
+            <w:r>
+              <w:rPr>
+                <w:rFonts w:ascii="Calibri" w:hAnsi="Calibri"/>
+                <w:sz w:val="19"/>
+              </w:rPr>
+              <w:t>Logistic Discriminant Analysis</w:t>
+            </w:r>
+          </w:p>
+        </w:tc>
+        <w:tc>
+          <w:tcPr>
+            <w:tcW w:type="dxa" w:w="1296"/>
+            <w:shd w:fill="FFFFFF"/>
+          </w:tcPr>
+          <w:p>
+            <w:pPr>
+              <w:spacing w:after="40" w:before="40"/>
+            </w:pPr>
+            <w:r>
+              <w:rPr>
+                <w:rFonts w:ascii="Calibri" w:hAnsi="Calibri"/>
+                <w:sz w:val="19"/>
+              </w:rPr>
+              <w:t>UCI Cleveland</w:t>
+            </w:r>
+          </w:p>
+        </w:tc>
+        <w:tc>
+          <w:tcPr>
+            <w:tcW w:type="dxa" w:w="1152"/>
+            <w:shd w:fill="FFFFFF"/>
+          </w:tcPr>
+          <w:p>
+            <w:pPr>
+              <w:spacing w:after="40" w:before="40"/>
+            </w:pPr>
+            <w:r>
+              <w:rPr>
+                <w:rFonts w:ascii="Calibri" w:hAnsi="Calibri"/>
+                <w:sz w:val="19"/>
+              </w:rPr>
+              <w:t>Shreyas</w:t>
+            </w:r>
+          </w:p>
+        </w:tc>
+      </w:tr>
+      <w:tr>
+        <w:tc>
+          <w:tcPr>
+            <w:tcW w:type="dxa" w:w="720"/>
+            <w:shd w:fill="F2F5F9"/>
+          </w:tcPr>
+          <w:p>
+            <w:pPr>
+              <w:spacing w:after="40" w:before="40"/>
+            </w:pPr>
+            <w:r>
+              <w:rPr>
+                <w:rFonts w:ascii="Calibri" w:hAnsi="Calibri"/>
+                <w:sz w:val="19"/>
+              </w:rPr>
+              <w:t>2</w:t>
+            </w:r>
+          </w:p>
+        </w:tc>
+        <w:tc>
+          <w:tcPr>
+            <w:tcW w:type="dxa" w:w="1728"/>
+            <w:shd w:fill="F2F5F9"/>
+          </w:tcPr>
+          <w:p>
+            <w:pPr>
+              <w:spacing w:after="40" w:before="40"/>
+            </w:pPr>
+            <w:r>
+              <w:rPr>
+                <w:rFonts w:ascii="Calibri" w:hAnsi="Calibri"/>
+                <w:sz w:val="19"/>
+              </w:rPr>
+              <w:t>Palaniappan &amp; Awang (2008)</w:t>
+            </w:r>
+          </w:p>
+        </w:tc>
+        <w:tc>
+          <w:tcPr>
+            <w:tcW w:type="dxa" w:w="3168"/>
+            <w:shd w:fill="F2F5F9"/>
+          </w:tcPr>
+          <w:p>
+            <w:pPr>
+              <w:spacing w:after="40" w:before="40"/>
+            </w:pPr>
+            <w:r>
+              <w:rPr>
+                <w:rFonts w:ascii="Calibri" w:hAnsi="Calibri"/>
+                <w:sz w:val="19"/>
+              </w:rPr>
+              <w:t>Intelligent Heart Disease Prediction System...</w:t>
+            </w:r>
+          </w:p>
+        </w:tc>
+        <w:tc>
+          <w:tcPr>
+            <w:tcW w:type="dxa" w:w="1872"/>
+            <w:shd w:fill="F2F5F9"/>
+          </w:tcPr>
+          <w:p>
+            <w:pPr>
+              <w:spacing w:after="40" w:before="40"/>
+            </w:pPr>
+            <w:r>
+              <w:rPr>
+                <w:rFonts w:ascii="Calibri" w:hAnsi="Calibri"/>
+                <w:sz w:val="19"/>
+              </w:rPr>
+              <w:t>IEEE AICCSA (IEEE)</w:t>
+            </w:r>
+          </w:p>
+        </w:tc>
+        <w:tc>
+          <w:tcPr>
+            <w:tcW w:type="dxa" w:w="2016"/>
+            <w:shd w:fill="F2F5F9"/>
+          </w:tcPr>
+          <w:p>
+            <w:pPr>
+              <w:spacing w:after="40" w:before="40"/>
+            </w:pPr>
+            <w:r>
+              <w:rPr>
+                <w:rFonts w:ascii="Calibri" w:hAnsi="Calibri"/>
+                <w:sz w:val="19"/>
+              </w:rPr>
+              <w:t>Multi-Model Mining Framework</w:t>
+            </w:r>
+          </w:p>
+        </w:tc>
+        <w:tc>
+          <w:tcPr>
+            <w:tcW w:type="dxa" w:w="1296"/>
+            <w:shd w:fill="F2F5F9"/>
+          </w:tcPr>
+          <w:p>
+            <w:pPr>
+              <w:spacing w:after="40" w:before="40"/>
+            </w:pPr>
+            <w:r>
+              <w:rPr>
+                <w:rFonts w:ascii="Calibri" w:hAnsi="Calibri"/>
+                <w:sz w:val="19"/>
+              </w:rPr>
+              <w:t>UCI Cleveland</w:t>
+            </w:r>
+          </w:p>
+        </w:tc>
+        <w:tc>
+          <w:tcPr>
+            <w:tcW w:type="dxa" w:w="1152"/>
+            <w:shd w:fill="F2F5F9"/>
+          </w:tcPr>
+          <w:p>
+            <w:pPr>
+              <w:spacing w:after="40" w:before="40"/>
+            </w:pPr>
+            <w:r>
+              <w:rPr>
+                <w:rFonts w:ascii="Calibri" w:hAnsi="Calibri"/>
+                <w:sz w:val="19"/>
+              </w:rPr>
+              <w:t>Shreyas</w:t>
+            </w:r>
+          </w:p>
+        </w:tc>
+      </w:tr>
+      <w:tr>
+        <w:tc>
+          <w:tcPr>
+            <w:tcW w:type="dxa" w:w="720"/>
+            <w:shd w:fill="FFFFFF"/>
+          </w:tcPr>
+          <w:p>
+            <w:pPr>
+              <w:spacing w:after="40" w:before="40"/>
+            </w:pPr>
+            <w:r>
+              <w:rPr>
+                <w:rFonts w:ascii="Calibri" w:hAnsi="Calibri"/>
+                <w:sz w:val="19"/>
+              </w:rPr>
+              <w:t>3</w:t>
+            </w:r>
+          </w:p>
+        </w:tc>
+        <w:tc>
+          <w:tcPr>
+            <w:tcW w:type="dxa" w:w="1728"/>
+            <w:shd w:fill="FFFFFF"/>
+          </w:tcPr>
+          <w:p>
+            <w:pPr>
+              <w:spacing w:after="40" w:before="40"/>
+            </w:pPr>
+            <w:r>
+              <w:rPr>
+                <w:rFonts w:ascii="Calibri" w:hAnsi="Calibri"/>
+                <w:sz w:val="19"/>
+              </w:rPr>
+              <w:t>Anooj (2012)</w:t>
+            </w:r>
+          </w:p>
+        </w:tc>
+        <w:tc>
+          <w:tcPr>
+            <w:tcW w:type="dxa" w:w="3168"/>
+            <w:shd w:fill="FFFFFF"/>
+          </w:tcPr>
+          <w:p>
+            <w:pPr>
+              <w:spacing w:after="40" w:before="40"/>
+            </w:pPr>
+            <w:r>
+              <w:rPr>
+                <w:rFonts w:ascii="Calibri" w:hAnsi="Calibri"/>
+                <w:sz w:val="19"/>
+              </w:rPr>
+              <w:t>Clinical decision support system: Risk level prediction...</w:t>
+            </w:r>
+          </w:p>
+        </w:tc>
+        <w:tc>
+          <w:tcPr>
+            <w:tcW w:type="dxa" w:w="1872"/>
+            <w:shd w:fill="FFFFFF"/>
+          </w:tcPr>
+          <w:p>
+            <w:pPr>
+              <w:spacing w:after="40" w:before="40"/>
+            </w:pPr>
+            <w:r>
+              <w:rPr>
+                <w:rFonts w:ascii="Calibri" w:hAnsi="Calibri"/>
+                <w:sz w:val="19"/>
+              </w:rPr>
+              <w:t>J King Saud Univ (Elsevier)</w:t>
+            </w:r>
+          </w:p>
+        </w:tc>
+        <w:tc>
+          <w:tcPr>
+            <w:tcW w:type="dxa" w:w="2016"/>
+            <w:shd w:fill="FFFFFF"/>
+          </w:tcPr>
+          <w:p>
+            <w:pPr>
+              <w:spacing w:after="40" w:before="40"/>
+            </w:pPr>
+            <w:r>
+              <w:rPr>
+                <w:rFonts w:ascii="Calibri" w:hAnsi="Calibri"/>
+                <w:sz w:val="19"/>
+              </w:rPr>
+              <w:t>Weighted Fuzzy Rule CDSS</w:t>
+            </w:r>
+          </w:p>
+        </w:tc>
+        <w:tc>
+          <w:tcPr>
+            <w:tcW w:type="dxa" w:w="1296"/>
+            <w:shd w:fill="FFFFFF"/>
+          </w:tcPr>
+          <w:p>
+            <w:pPr>
+              <w:spacing w:after="40" w:before="40"/>
+            </w:pPr>
+            <w:r>
+              <w:rPr>
+                <w:rFonts w:ascii="Calibri" w:hAnsi="Calibri"/>
+                <w:sz w:val="19"/>
+              </w:rPr>
+              <w:t>UCI Cleveland</w:t>
+            </w:r>
+          </w:p>
+        </w:tc>
+        <w:tc>
+          <w:tcPr>
+            <w:tcW w:type="dxa" w:w="1152"/>
+            <w:shd w:fill="FFFFFF"/>
+          </w:tcPr>
+          <w:p>
+            <w:pPr>
+              <w:spacing w:after="40" w:before="40"/>
+            </w:pPr>
+            <w:r>
+              <w:rPr>
+                <w:rFonts w:ascii="Calibri" w:hAnsi="Calibri"/>
+                <w:sz w:val="19"/>
+              </w:rPr>
+              <w:t>Uday</w:t>
+            </w:r>
+          </w:p>
+        </w:tc>
+      </w:tr>
+      <w:tr>
+        <w:tc>
+          <w:tcPr>
+            <w:tcW w:type="dxa" w:w="720"/>
+            <w:shd w:fill="F2F5F9"/>
+          </w:tcPr>
+          <w:p>
+            <w:pPr>
+              <w:spacing w:after="40" w:before="40"/>
+            </w:pPr>
+            <w:r>
+              <w:rPr>
+                <w:rFonts w:ascii="Calibri" w:hAnsi="Calibri"/>
+                <w:sz w:val="19"/>
+              </w:rPr>
+              <w:t>4</w:t>
+            </w:r>
+          </w:p>
+        </w:tc>
+        <w:tc>
+          <w:tcPr>
+            <w:tcW w:type="dxa" w:w="1728"/>
+            <w:shd w:fill="F2F5F9"/>
+          </w:tcPr>
+          <w:p>
+            <w:pPr>
+              <w:spacing w:after="40" w:before="40"/>
+            </w:pPr>
+            <w:r>
+              <w:rPr>
+                <w:rFonts w:ascii="Calibri" w:hAnsi="Calibri"/>
+                <w:sz w:val="19"/>
+              </w:rPr>
+              <w:t>Arabasadi et al. (2017)</w:t>
+            </w:r>
+          </w:p>
+        </w:tc>
+        <w:tc>
+          <w:tcPr>
+            <w:tcW w:type="dxa" w:w="3168"/>
+            <w:shd w:fill="F2F5F9"/>
+          </w:tcPr>
+          <w:p>
+            <w:pPr>
+              <w:spacing w:after="40" w:before="40"/>
+            </w:pPr>
+            <w:r>
+              <w:rPr>
+                <w:rFonts w:ascii="Calibri" w:hAnsi="Calibri"/>
+                <w:sz w:val="19"/>
+              </w:rPr>
+              <w:t>Computer aided decision making for heart disease...</w:t>
+            </w:r>
+          </w:p>
+        </w:tc>
+        <w:tc>
+          <w:tcPr>
+            <w:tcW w:type="dxa" w:w="1872"/>
+            <w:shd w:fill="F2F5F9"/>
+          </w:tcPr>
+          <w:p>
+            <w:pPr>
+              <w:spacing w:after="40" w:before="40"/>
+            </w:pPr>
+            <w:r>
+              <w:rPr>
+                <w:rFonts w:ascii="Calibri" w:hAnsi="Calibri"/>
+                <w:sz w:val="19"/>
+              </w:rPr>
+              <w:t>Comput Meth Prog Bio (Elsevier)</w:t>
+            </w:r>
+          </w:p>
+        </w:tc>
+        <w:tc>
+          <w:tcPr>
+            <w:tcW w:type="dxa" w:w="2016"/>
+            <w:shd w:fill="F2F5F9"/>
+          </w:tcPr>
+          <w:p>
+            <w:pPr>
+              <w:spacing w:after="40" w:before="40"/>
+            </w:pPr>
+            <w:r>
+              <w:rPr>
+                <w:rFonts w:ascii="Calibri" w:hAnsi="Calibri"/>
+                <w:sz w:val="19"/>
+              </w:rPr>
+              <w:t>Hybrid GA-NN Classifier</w:t>
+            </w:r>
+          </w:p>
+        </w:tc>
+        <w:tc>
+          <w:tcPr>
+            <w:tcW w:type="dxa" w:w="1296"/>
+            <w:shd w:fill="F2F5F9"/>
+          </w:tcPr>
+          <w:p>
+            <w:pPr>
+              <w:spacing w:after="40" w:before="40"/>
+            </w:pPr>
+            <w:r>
+              <w:rPr>
+                <w:rFonts w:ascii="Calibri" w:hAnsi="Calibri"/>
+                <w:sz w:val="19"/>
+              </w:rPr>
+              <w:t>UCI Cleveland</w:t>
+            </w:r>
+          </w:p>
+        </w:tc>
+        <w:tc>
+          <w:tcPr>
+            <w:tcW w:type="dxa" w:w="1152"/>
+            <w:shd w:fill="F2F5F9"/>
+          </w:tcPr>
+          <w:p>
+            <w:pPr>
+              <w:spacing w:after="40" w:before="40"/>
+            </w:pPr>
+            <w:r>
+              <w:rPr>
+                <w:rFonts w:ascii="Calibri" w:hAnsi="Calibri"/>
+                <w:sz w:val="19"/>
+              </w:rPr>
+              <w:t>Uday</w:t>
+            </w:r>
+          </w:p>
+        </w:tc>
+      </w:tr>
+      <w:tr>
+        <w:tc>
+          <w:tcPr>
+            <w:tcW w:type="dxa" w:w="720"/>
+            <w:shd w:fill="FFFFFF"/>
+          </w:tcPr>
+          <w:p>
+            <w:pPr>
+              <w:spacing w:after="40" w:before="40"/>
+            </w:pPr>
+            <w:r>
+              <w:rPr>
+                <w:rFonts w:ascii="Calibri" w:hAnsi="Calibri"/>
+                <w:sz w:val="19"/>
+              </w:rPr>
+              <w:t>5</w:t>
+            </w:r>
+          </w:p>
+        </w:tc>
+        <w:tc>
+          <w:tcPr>
+            <w:tcW w:type="dxa" w:w="1728"/>
+            <w:shd w:fill="FFFFFF"/>
+          </w:tcPr>
+          <w:p>
+            <w:pPr>
+              <w:spacing w:after="40" w:before="40"/>
+            </w:pPr>
+            <w:r>
+              <w:rPr>
+                <w:rFonts w:ascii="Calibri" w:hAnsi="Calibri"/>
+                <w:sz w:val="19"/>
+              </w:rPr>
+              <w:t>Haq et al. (2018)</w:t>
+            </w:r>
+          </w:p>
+        </w:tc>
+        <w:tc>
+          <w:tcPr>
+            <w:tcW w:type="dxa" w:w="3168"/>
+            <w:shd w:fill="FFFFFF"/>
+          </w:tcPr>
+          <w:p>
+            <w:pPr>
+              <w:spacing w:after="40" w:before="40"/>
+            </w:pPr>
+            <w:r>
+              <w:rPr>
+                <w:rFonts w:ascii="Calibri" w:hAnsi="Calibri"/>
+                <w:sz w:val="19"/>
+              </w:rPr>
+              <w:t>A Hybrid Intelligent System Framework for Prediction...</w:t>
+            </w:r>
+          </w:p>
+        </w:tc>
+        <w:tc>
+          <w:tcPr>
+            <w:tcW w:type="dxa" w:w="1872"/>
+            <w:shd w:fill="FFFFFF"/>
+          </w:tcPr>
+          <w:p>
+            <w:pPr>
+              <w:spacing w:after="40" w:before="40"/>
+            </w:pPr>
+            <w:r>
+              <w:rPr>
+                <w:rFonts w:ascii="Calibri" w:hAnsi="Calibri"/>
+                <w:sz w:val="19"/>
+              </w:rPr>
+              <w:t>Mobile Info Syst (Wiley)</w:t>
+            </w:r>
+          </w:p>
+        </w:tc>
+        <w:tc>
+          <w:tcPr>
+            <w:tcW w:type="dxa" w:w="2016"/>
+            <w:shd w:fill="FFFFFF"/>
+          </w:tcPr>
+          <w:p>
+            <w:pPr>
+              <w:spacing w:after="40" w:before="40"/>
+            </w:pPr>
+            <w:r>
+              <w:rPr>
+                <w:rFonts w:ascii="Calibri" w:hAnsi="Calibri"/>
+                <w:sz w:val="19"/>
+              </w:rPr>
+              <w:t>Hybrid ML + Feature Selection</w:t>
+            </w:r>
+          </w:p>
+        </w:tc>
+        <w:tc>
+          <w:tcPr>
+            <w:tcW w:type="dxa" w:w="1296"/>
+            <w:shd w:fill="FFFFFF"/>
+          </w:tcPr>
+          <w:p>
+            <w:pPr>
+              <w:spacing w:after="40" w:before="40"/>
+            </w:pPr>
+            <w:r>
+              <w:rPr>
+                <w:rFonts w:ascii="Calibri" w:hAnsi="Calibri"/>
+                <w:sz w:val="19"/>
+              </w:rPr>
+              <w:t>UCI Cleveland</w:t>
+            </w:r>
+          </w:p>
+        </w:tc>
+        <w:tc>
+          <w:tcPr>
+            <w:tcW w:type="dxa" w:w="1152"/>
+            <w:shd w:fill="FFFFFF"/>
+          </w:tcPr>
+          <w:p>
+            <w:pPr>
+              <w:spacing w:after="40" w:before="40"/>
+            </w:pPr>
+            <w:r>
+              <w:rPr>
+                <w:rFonts w:ascii="Calibri" w:hAnsi="Calibri"/>
+                <w:sz w:val="19"/>
+              </w:rPr>
+              <w:t>Suprith</w:t>
+            </w:r>
+          </w:p>
+        </w:tc>
+      </w:tr>
+      <w:tr>
+        <w:tc>
+          <w:tcPr>
+            <w:tcW w:type="dxa" w:w="720"/>
+            <w:shd w:fill="F2F5F9"/>
+          </w:tcPr>
+          <w:p>
+            <w:pPr>
+              <w:spacing w:after="40" w:before="40"/>
+            </w:pPr>
+            <w:r>
+              <w:rPr>
+                <w:rFonts w:ascii="Calibri" w:hAnsi="Calibri"/>
+                <w:sz w:val="19"/>
+              </w:rPr>
+              <w:t>6</w:t>
+            </w:r>
+          </w:p>
+        </w:tc>
+        <w:tc>
+          <w:tcPr>
+            <w:tcW w:type="dxa" w:w="1728"/>
+            <w:shd w:fill="F2F5F9"/>
+          </w:tcPr>
+          <w:p>
+            <w:pPr>
+              <w:spacing w:after="40" w:before="40"/>
+            </w:pPr>
+            <w:r>
+              <w:rPr>
+                <w:rFonts w:ascii="Calibri" w:hAnsi="Calibri"/>
+                <w:sz w:val="19"/>
+              </w:rPr>
+              <w:t>Mohan et al. (2019)</w:t>
+            </w:r>
+          </w:p>
+        </w:tc>
+        <w:tc>
+          <w:tcPr>
+            <w:tcW w:type="dxa" w:w="3168"/>
+            <w:shd w:fill="F2F5F9"/>
+          </w:tcPr>
+          <w:p>
+            <w:pPr>
+              <w:spacing w:after="40" w:before="40"/>
+            </w:pPr>
+            <w:r>
+              <w:rPr>
+                <w:rFonts w:ascii="Calibri" w:hAnsi="Calibri"/>
+                <w:sz w:val="19"/>
+              </w:rPr>
+              <w:t>Effective Heart Disease Prediction Using Hybrid ML...</w:t>
+            </w:r>
+          </w:p>
+        </w:tc>
+        <w:tc>
+          <w:tcPr>
+            <w:tcW w:type="dxa" w:w="1872"/>
+            <w:shd w:fill="F2F5F9"/>
+          </w:tcPr>
+          <w:p>
+            <w:pPr>
+              <w:spacing w:after="40" w:before="40"/>
+            </w:pPr>
+            <w:r>
+              <w:rPr>
+                <w:rFonts w:ascii="Calibri" w:hAnsi="Calibri"/>
+                <w:sz w:val="19"/>
+              </w:rPr>
+              <w:t>IEEE Access (IEEE)</w:t>
+            </w:r>
+          </w:p>
+        </w:tc>
+        <w:tc>
+          <w:tcPr>
+            <w:tcW w:type="dxa" w:w="2016"/>
+            <w:shd w:fill="F2F5F9"/>
+          </w:tcPr>
+          <w:p>
+            <w:pPr>
+              <w:spacing w:after="40" w:before="40"/>
+            </w:pPr>
+            <w:r>
+              <w:rPr>
+                <w:rFonts w:ascii="Calibri" w:hAnsi="Calibri"/>
+                <w:sz w:val="19"/>
+              </w:rPr>
+              <w:t>Hybrid Random Forest Linear</w:t>
+            </w:r>
+          </w:p>
+        </w:tc>
+        <w:tc>
+          <w:tcPr>
+            <w:tcW w:type="dxa" w:w="1296"/>
+            <w:shd w:fill="F2F5F9"/>
+          </w:tcPr>
+          <w:p>
+            <w:pPr>
+              <w:spacing w:after="40" w:before="40"/>
+            </w:pPr>
+            <w:r>
+              <w:rPr>
+                <w:rFonts w:ascii="Calibri" w:hAnsi="Calibri"/>
+                <w:sz w:val="19"/>
+              </w:rPr>
+              <w:t>UCI Cleveland</w:t>
+            </w:r>
+          </w:p>
+        </w:tc>
+        <w:tc>
+          <w:tcPr>
+            <w:tcW w:type="dxa" w:w="1152"/>
+            <w:shd w:fill="F2F5F9"/>
+          </w:tcPr>
+          <w:p>
+            <w:pPr>
+              <w:spacing w:after="40" w:before="40"/>
+            </w:pPr>
+            <w:r>
+              <w:rPr>
+                <w:rFonts w:ascii="Calibri" w:hAnsi="Calibri"/>
+                <w:sz w:val="19"/>
+              </w:rPr>
+              <w:t>Suprith</w:t>
+            </w:r>
+          </w:p>
+        </w:tc>
+      </w:tr>
+      <w:tr>
+        <w:tc>
+          <w:tcPr>
+            <w:tcW w:type="dxa" w:w="720"/>
+            <w:shd w:fill="FFFFFF"/>
+          </w:tcPr>
+          <w:p>
+            <w:pPr>
+              <w:spacing w:after="40" w:before="40"/>
+            </w:pPr>
+            <w:r>
+              <w:rPr>
+                <w:rFonts w:ascii="Calibri" w:hAnsi="Calibri"/>
+                <w:sz w:val="19"/>
+              </w:rPr>
+              <w:t>7</w:t>
+            </w:r>
+          </w:p>
+        </w:tc>
+        <w:tc>
+          <w:tcPr>
+            <w:tcW w:type="dxa" w:w="1728"/>
+            <w:shd w:fill="FFFFFF"/>
+          </w:tcPr>
+          <w:p>
+            <w:pPr>
+              <w:spacing w:after="40" w:before="40"/>
+            </w:pPr>
+            <w:r>
+              <w:rPr>
+                <w:rFonts w:ascii="Calibri" w:hAnsi="Calibri"/>
+                <w:sz w:val="19"/>
+              </w:rPr>
+              <w:t>Latha &amp; Jeeva (2019)</w:t>
+            </w:r>
+          </w:p>
+        </w:tc>
+        <w:tc>
+          <w:tcPr>
+            <w:tcW w:type="dxa" w:w="3168"/>
+            <w:shd w:fill="FFFFFF"/>
+          </w:tcPr>
+          <w:p>
+            <w:pPr>
+              <w:spacing w:after="40" w:before="40"/>
+            </w:pPr>
+            <w:r>
+              <w:rPr>
+                <w:rFonts w:ascii="Calibri" w:hAnsi="Calibri"/>
+                <w:sz w:val="19"/>
+              </w:rPr>
+              <w:t>Improving the accuracy of prediction of heart disease...</w:t>
+            </w:r>
+          </w:p>
+        </w:tc>
+        <w:tc>
+          <w:tcPr>
+            <w:tcW w:type="dxa" w:w="1872"/>
+            <w:shd w:fill="FFFFFF"/>
+          </w:tcPr>
+          <w:p>
+            <w:pPr>
+              <w:spacing w:after="40" w:before="40"/>
+            </w:pPr>
+            <w:r>
+              <w:rPr>
+                <w:rFonts w:ascii="Calibri" w:hAnsi="Calibri"/>
+                <w:sz w:val="19"/>
+              </w:rPr>
+              <w:t>Informat Med Unlocked (Elsevier)</w:t>
+            </w:r>
+          </w:p>
+        </w:tc>
+        <w:tc>
+          <w:tcPr>
+            <w:tcW w:type="dxa" w:w="2016"/>
+            <w:shd w:fill="FFFFFF"/>
+          </w:tcPr>
+          <w:p>
+            <w:pPr>
+              <w:spacing w:after="40" w:before="40"/>
+            </w:pPr>
+            <w:r>
+              <w:rPr>
+                <w:rFonts w:ascii="Calibri" w:hAnsi="Calibri"/>
+                <w:sz w:val="19"/>
+              </w:rPr>
+              <w:t>Ensemble Bagging &amp; Boosting</w:t>
+            </w:r>
+          </w:p>
+        </w:tc>
+        <w:tc>
+          <w:tcPr>
+            <w:tcW w:type="dxa" w:w="1296"/>
+            <w:shd w:fill="FFFFFF"/>
+          </w:tcPr>
+          <w:p>
+            <w:pPr>
+              <w:spacing w:after="40" w:before="40"/>
+            </w:pPr>
+            <w:r>
+              <w:rPr>
+                <w:rFonts w:ascii="Calibri" w:hAnsi="Calibri"/>
+                <w:sz w:val="19"/>
+              </w:rPr>
+              <w:t>UCI Cleveland</w:t>
+            </w:r>
+          </w:p>
+        </w:tc>
+        <w:tc>
+          <w:tcPr>
+            <w:tcW w:type="dxa" w:w="1152"/>
+            <w:shd w:fill="FFFFFF"/>
+          </w:tcPr>
+          <w:p>
+            <w:pPr>
+              <w:spacing w:after="40" w:before="40"/>
+            </w:pPr>
+            <w:r>
+              <w:rPr>
+                <w:rFonts w:ascii="Calibri" w:hAnsi="Calibri"/>
+                <w:sz w:val="19"/>
+              </w:rPr>
+              <w:t>Sahitya</w:t>
+            </w:r>
+          </w:p>
+        </w:tc>
+      </w:tr>
+      <w:tr>
+        <w:tc>
+          <w:tcPr>
+            <w:tcW w:type="dxa" w:w="720"/>
+            <w:shd w:fill="F2F5F9"/>
+          </w:tcPr>
+          <w:p>
+            <w:pPr>
+              <w:spacing w:after="40" w:before="40"/>
+            </w:pPr>
+            <w:r>
+              <w:rPr>
+                <w:rFonts w:ascii="Calibri" w:hAnsi="Calibri"/>
+                <w:sz w:val="19"/>
+              </w:rPr>
+              <w:t>8</w:t>
+            </w:r>
+          </w:p>
+        </w:tc>
+        <w:tc>
+          <w:tcPr>
+            <w:tcW w:type="dxa" w:w="1728"/>
+            <w:shd w:fill="F2F5F9"/>
+          </w:tcPr>
+          <w:p>
+            <w:pPr>
+              <w:spacing w:after="40" w:before="40"/>
+            </w:pPr>
+            <w:r>
+              <w:rPr>
+                <w:rFonts w:ascii="Calibri" w:hAnsi="Calibri"/>
+                <w:sz w:val="19"/>
+              </w:rPr>
+              <w:t>Gokulnath &amp; Shantharajah (2019)</w:t>
+            </w:r>
+          </w:p>
+        </w:tc>
+        <w:tc>
+          <w:tcPr>
+            <w:tcW w:type="dxa" w:w="3168"/>
+            <w:shd w:fill="F2F5F9"/>
+          </w:tcPr>
+          <w:p>
+            <w:pPr>
+              <w:spacing w:after="40" w:before="40"/>
+            </w:pPr>
+            <w:r>
+              <w:rPr>
+                <w:rFonts w:ascii="Calibri" w:hAnsi="Calibri"/>
+                <w:sz w:val="19"/>
+              </w:rPr>
+              <w:t>An optimized feature selection based on genetic approach...</w:t>
+            </w:r>
+          </w:p>
+        </w:tc>
+        <w:tc>
+          <w:tcPr>
+            <w:tcW w:type="dxa" w:w="1872"/>
+            <w:shd w:fill="F2F5F9"/>
+          </w:tcPr>
+          <w:p>
+            <w:pPr>
+              <w:spacing w:after="40" w:before="40"/>
+            </w:pPr>
+            <w:r>
+              <w:rPr>
+                <w:rFonts w:ascii="Calibri" w:hAnsi="Calibri"/>
+                <w:sz w:val="19"/>
+              </w:rPr>
+              <w:t>Cluster Comput (Springer)</w:t>
+            </w:r>
+          </w:p>
+        </w:tc>
+        <w:tc>
+          <w:tcPr>
+            <w:tcW w:type="dxa" w:w="2016"/>
+            <w:shd w:fill="F2F5F9"/>
+          </w:tcPr>
+          <w:p>
+            <w:pPr>
+              <w:spacing w:after="40" w:before="40"/>
+            </w:pPr>
+            <w:r>
+              <w:rPr>
+                <w:rFonts w:ascii="Calibri" w:hAnsi="Calibri"/>
+                <w:sz w:val="19"/>
+              </w:rPr>
+              <w:t>GA-Optimized SVM</w:t>
+            </w:r>
+          </w:p>
+        </w:tc>
+        <w:tc>
+          <w:tcPr>
+            <w:tcW w:type="dxa" w:w="1296"/>
+            <w:shd w:fill="F2F5F9"/>
+          </w:tcPr>
+          <w:p>
+            <w:pPr>
+              <w:spacing w:after="40" w:before="40"/>
+            </w:pPr>
+            <w:r>
+              <w:rPr>
+                <w:rFonts w:ascii="Calibri" w:hAnsi="Calibri"/>
+                <w:sz w:val="19"/>
+              </w:rPr>
+              <w:t>UCI Cleveland</w:t>
+            </w:r>
+          </w:p>
+        </w:tc>
+        <w:tc>
+          <w:tcPr>
+            <w:tcW w:type="dxa" w:w="1152"/>
+            <w:shd w:fill="F2F5F9"/>
+          </w:tcPr>
+          <w:p>
+            <w:pPr>
+              <w:spacing w:after="40" w:before="40"/>
+            </w:pPr>
+            <w:r>
+              <w:rPr>
+                <w:rFonts w:ascii="Calibri" w:hAnsi="Calibri"/>
+                <w:sz w:val="19"/>
+              </w:rPr>
+              <w:t>Sahitya</w:t>
+            </w:r>
+          </w:p>
+        </w:tc>
+      </w:tr>
+    </w:tbl>
+    <w:p>
+      <w:pPr>
+        <w:keepNext/>
+        <w:spacing w:before="200" w:after="80"/>
+      </w:pPr>
+      <w:r>
+        <w:rPr>
+          <w:rFonts w:ascii="Arial" w:hAnsi="Arial"/>
+          <w:b/>
+          <w:color w:val="4B6B94"/>
+          <w:sz w:val="26"/>
+        </w:rPr>
+        <w:t>3.2 Deep Learning Literature (8 Papers)</w:t>
+      </w:r>
+    </w:p>
+    <w:p>
+      <w:pPr>
+        <w:spacing w:before="0" w:after="120" w:line="276" w:lineRule="auto"/>
+      </w:pPr>
+      <w:r>
+        <w:rPr>
+          <w:rFonts w:ascii="Calibri" w:hAnsi="Calibri"/>
+          <w:sz w:val="22"/>
+        </w:rPr>
+        <w:t>Deep learning literature explores multi-layer perceptrons (ANNs), autoencoders, and convolutional architectures for non-linear representation learning.</w:t>
+      </w:r>
+    </w:p>
+    <w:tbl>
+      <w:tblPr>
+        <w:tblW w:type="auto" w:w="0"/>
+        <w:jc w:val="center"/>
+        <w:tblLook w:firstColumn="1" w:firstRow="1" w:lastColumn="0" w:lastRow="0" w:noHBand="0" w:noVBand="1" w:val="04A0"/>
+      </w:tblPr>
+      <w:tblGrid>
+        <w:gridCol w:w="1337"/>
+        <w:gridCol w:w="1337"/>
+        <w:gridCol w:w="1337"/>
+        <w:gridCol w:w="1337"/>
+        <w:gridCol w:w="1337"/>
+        <w:gridCol w:w="1337"/>
+        <w:gridCol w:w="1337"/>
+      </w:tblGrid>
+      <w:tr>
+        <w:tc>
+          <w:tcPr>
+            <w:tcW w:type="dxa" w:w="720"/>
+            <w:shd w:fill="1B365D"/>
+          </w:tcPr>
+          <w:p>
+            <w:pPr>
+              <w:jc w:val="center"/>
+            </w:pPr>
+            <w:r>
+              <w:rPr>
+                <w:rFonts w:ascii="Arial" w:hAnsi="Arial"/>
+                <w:b/>
+                <w:color w:val="FFFFFF"/>
+                <w:sz w:val="19"/>
+              </w:rPr>
+              <w:t>Sl No</w:t>
+            </w:r>
+          </w:p>
+        </w:tc>
+        <w:tc>
+          <w:tcPr>
+            <w:tcW w:type="dxa" w:w="1728"/>
+            <w:shd w:fill="1B365D"/>
+          </w:tcPr>
+          <w:p>
+            <w:pPr>
+              <w:jc w:val="center"/>
+            </w:pPr>
+            <w:r>
+              <w:rPr>
+                <w:rFonts w:ascii="Arial" w:hAnsi="Arial"/>
+                <w:b/>
+                <w:color w:val="FFFFFF"/>
+                <w:sz w:val="19"/>
+              </w:rPr>
+              <w:t>Author/Year</w:t>
+            </w:r>
+          </w:p>
+        </w:tc>
+        <w:tc>
+          <w:tcPr>
+            <w:tcW w:type="dxa" w:w="3168"/>
+            <w:shd w:fill="1B365D"/>
+          </w:tcPr>
+          <w:p>
+            <w:pPr>
+              <w:jc w:val="center"/>
+            </w:pPr>
+            <w:r>
+              <w:rPr>
+                <w:rFonts w:ascii="Arial" w:hAnsi="Arial"/>
+                <w:b/>
+                <w:color w:val="FFFFFF"/>
+                <w:sz w:val="19"/>
+              </w:rPr>
+              <w:t>Paper Title</w:t>
+            </w:r>
+          </w:p>
+        </w:tc>
+        <w:tc>
+          <w:tcPr>
+            <w:tcW w:type="dxa" w:w="1872"/>
+            <w:shd w:fill="1B365D"/>
+          </w:tcPr>
+          <w:p>
+            <w:pPr>
+              <w:jc w:val="center"/>
+            </w:pPr>
+            <w:r>
+              <w:rPr>
+                <w:rFonts w:ascii="Arial" w:hAnsi="Arial"/>
+                <w:b/>
+                <w:color w:val="FFFFFF"/>
+                <w:sz w:val="19"/>
+              </w:rPr>
+              <w:t>Journal / Publisher</w:t>
+            </w:r>
+          </w:p>
+        </w:tc>
+        <w:tc>
+          <w:tcPr>
+            <w:tcW w:type="dxa" w:w="2016"/>
+            <w:shd w:fill="1B365D"/>
+          </w:tcPr>
+          <w:p>
+            <w:pPr>
+              <w:jc w:val="center"/>
+            </w:pPr>
+            <w:r>
+              <w:rPr>
+                <w:rFonts w:ascii="Arial" w:hAnsi="Arial"/>
+                <w:b/>
+                <w:color w:val="FFFFFF"/>
+                <w:sz w:val="19"/>
+              </w:rPr>
+              <w:t>Main Method</w:t>
+            </w:r>
+          </w:p>
+        </w:tc>
+        <w:tc>
+          <w:tcPr>
+            <w:tcW w:type="dxa" w:w="1296"/>
+            <w:shd w:fill="1B365D"/>
+          </w:tcPr>
+          <w:p>
+            <w:pPr>
+              <w:jc w:val="center"/>
+            </w:pPr>
+            <w:r>
+              <w:rPr>
+                <w:rFonts w:ascii="Arial" w:hAnsi="Arial"/>
+                <w:b/>
+                <w:color w:val="FFFFFF"/>
+                <w:sz w:val="19"/>
+              </w:rPr>
+              <w:t>Dataset</w:t>
+            </w:r>
+          </w:p>
+        </w:tc>
+        <w:tc>
+          <w:tcPr>
+            <w:tcW w:type="dxa" w:w="1152"/>
+            <w:shd w:fill="1B365D"/>
+          </w:tcPr>
+          <w:p>
+            <w:pPr>
+              <w:jc w:val="center"/>
+            </w:pPr>
+            <w:r>
+              <w:rPr>
+                <w:rFonts w:ascii="Arial" w:hAnsi="Arial"/>
+                <w:b/>
+                <w:color w:val="FFFFFF"/>
+                <w:sz w:val="19"/>
+              </w:rPr>
+              <w:t>Team Member</w:t>
+            </w:r>
+          </w:p>
+        </w:tc>
+      </w:tr>
+      <w:tr>
+        <w:tc>
+          <w:tcPr>
+            <w:tcW w:type="dxa" w:w="720"/>
+            <w:shd w:fill="FFFFFF"/>
+          </w:tcPr>
+          <w:p>
+            <w:pPr>
+              <w:spacing w:after="40" w:before="40"/>
+            </w:pPr>
+            <w:r>
+              <w:rPr>
+                <w:rFonts w:ascii="Calibri" w:hAnsi="Calibri"/>
+                <w:sz w:val="19"/>
+              </w:rPr>
+              <w:t>9</w:t>
+            </w:r>
+          </w:p>
+        </w:tc>
+        <w:tc>
+          <w:tcPr>
+            <w:tcW w:type="dxa" w:w="1728"/>
+            <w:shd w:fill="FFFFFF"/>
+          </w:tcPr>
+          <w:p>
+            <w:pPr>
+              <w:spacing w:after="40" w:before="40"/>
+            </w:pPr>
+            <w:r>
+              <w:rPr>
+                <w:rFonts w:ascii="Calibri" w:hAnsi="Calibri"/>
+                <w:sz w:val="19"/>
+              </w:rPr>
+              <w:t>Mienye et al. (2020)</w:t>
+            </w:r>
+          </w:p>
+        </w:tc>
+        <w:tc>
+          <w:tcPr>
+            <w:tcW w:type="dxa" w:w="3168"/>
+            <w:shd w:fill="FFFFFF"/>
+          </w:tcPr>
+          <w:p>
+            <w:pPr>
+              <w:spacing w:after="40" w:before="40"/>
+            </w:pPr>
+            <w:r>
+              <w:rPr>
+                <w:rFonts w:ascii="Calibri" w:hAnsi="Calibri"/>
+                <w:sz w:val="19"/>
+              </w:rPr>
+              <w:t>Improved sparse autoencoder based artificial neural network...</w:t>
+            </w:r>
+          </w:p>
+        </w:tc>
+        <w:tc>
+          <w:tcPr>
+            <w:tcW w:type="dxa" w:w="1872"/>
+            <w:shd w:fill="FFFFFF"/>
+          </w:tcPr>
+          <w:p>
+            <w:pPr>
+              <w:spacing w:after="40" w:before="40"/>
+            </w:pPr>
+            <w:r>
+              <w:rPr>
+                <w:rFonts w:ascii="Calibri" w:hAnsi="Calibri"/>
+                <w:sz w:val="19"/>
+              </w:rPr>
+              <w:t>Informat Med Unlocked (Elsevier)</w:t>
+            </w:r>
+          </w:p>
+        </w:tc>
+        <w:tc>
+          <w:tcPr>
+            <w:tcW w:type="dxa" w:w="2016"/>
+            <w:shd w:fill="FFFFFF"/>
+          </w:tcPr>
+          <w:p>
+            <w:pPr>
+              <w:spacing w:after="40" w:before="40"/>
+            </w:pPr>
+            <w:r>
+              <w:rPr>
+                <w:rFonts w:ascii="Calibri" w:hAnsi="Calibri"/>
+                <w:sz w:val="19"/>
+              </w:rPr>
+              <w:t>Sparse Autoencoder ANN</w:t>
+            </w:r>
+          </w:p>
+        </w:tc>
+        <w:tc>
+          <w:tcPr>
+            <w:tcW w:type="dxa" w:w="1296"/>
+            <w:shd w:fill="FFFFFF"/>
+          </w:tcPr>
+          <w:p>
+            <w:pPr>
+              <w:spacing w:after="40" w:before="40"/>
+            </w:pPr>
+            <w:r>
+              <w:rPr>
+                <w:rFonts w:ascii="Calibri" w:hAnsi="Calibri"/>
+                <w:sz w:val="19"/>
+              </w:rPr>
+              <w:t>UCI Cleveland</w:t>
+            </w:r>
+          </w:p>
+        </w:tc>
+        <w:tc>
+          <w:tcPr>
+            <w:tcW w:type="dxa" w:w="1152"/>
+            <w:shd w:fill="FFFFFF"/>
+          </w:tcPr>
+          <w:p>
+            <w:pPr>
+              <w:spacing w:after="40" w:before="40"/>
+            </w:pPr>
+            <w:r>
+              <w:rPr>
+                <w:rFonts w:ascii="Calibri" w:hAnsi="Calibri"/>
+                <w:sz w:val="19"/>
+              </w:rPr>
+              <w:t>Shreyas</w:t>
+            </w:r>
+          </w:p>
+        </w:tc>
+      </w:tr>
+      <w:tr>
+        <w:tc>
+          <w:tcPr>
+            <w:tcW w:type="dxa" w:w="720"/>
+            <w:shd w:fill="F2F5F9"/>
+          </w:tcPr>
+          <w:p>
+            <w:pPr>
+              <w:spacing w:after="40" w:before="40"/>
+            </w:pPr>
+            <w:r>
+              <w:rPr>
+                <w:rFonts w:ascii="Calibri" w:hAnsi="Calibri"/>
+                <w:sz w:val="19"/>
+              </w:rPr>
+              <w:t>10</w:t>
+            </w:r>
+          </w:p>
+        </w:tc>
+        <w:tc>
+          <w:tcPr>
+            <w:tcW w:type="dxa" w:w="1728"/>
+            <w:shd w:fill="F2F5F9"/>
+          </w:tcPr>
+          <w:p>
+            <w:pPr>
+              <w:spacing w:after="40" w:before="40"/>
+            </w:pPr>
+            <w:r>
+              <w:rPr>
+                <w:rFonts w:ascii="Calibri" w:hAnsi="Calibri"/>
+                <w:sz w:val="19"/>
+              </w:rPr>
+              <w:t>Ali et al. (2020)</w:t>
+            </w:r>
+          </w:p>
+        </w:tc>
+        <w:tc>
+          <w:tcPr>
+            <w:tcW w:type="dxa" w:w="3168"/>
+            <w:shd w:fill="F2F5F9"/>
+          </w:tcPr>
+          <w:p>
+            <w:pPr>
+              <w:spacing w:after="40" w:before="40"/>
+            </w:pPr>
+            <w:r>
+              <w:rPr>
+                <w:rFonts w:ascii="Calibri" w:hAnsi="Calibri"/>
+                <w:sz w:val="19"/>
+              </w:rPr>
+              <w:t>A Smart Healthcare Monitoring System for Heart Disease...</w:t>
+            </w:r>
+          </w:p>
+        </w:tc>
+        <w:tc>
+          <w:tcPr>
+            <w:tcW w:type="dxa" w:w="1872"/>
+            <w:shd w:fill="F2F5F9"/>
+          </w:tcPr>
+          <w:p>
+            <w:pPr>
+              <w:spacing w:after="40" w:before="40"/>
+            </w:pPr>
+            <w:r>
+              <w:rPr>
+                <w:rFonts w:ascii="Calibri" w:hAnsi="Calibri"/>
+                <w:sz w:val="19"/>
+              </w:rPr>
+              <w:t>Info Fusion (Elsevier)</w:t>
+            </w:r>
+          </w:p>
+        </w:tc>
+        <w:tc>
+          <w:tcPr>
+            <w:tcW w:type="dxa" w:w="2016"/>
+            <w:shd w:fill="F2F5F9"/>
+          </w:tcPr>
+          <w:p>
+            <w:pPr>
+              <w:spacing w:after="40" w:before="40"/>
+            </w:pPr>
+            <w:r>
+              <w:rPr>
+                <w:rFonts w:ascii="Calibri" w:hAnsi="Calibri"/>
+                <w:sz w:val="19"/>
+              </w:rPr>
+              <w:t>Ensemble DNN + Feature Fusion</w:t>
+            </w:r>
+          </w:p>
+        </w:tc>
+        <w:tc>
+          <w:tcPr>
+            <w:tcW w:type="dxa" w:w="1296"/>
+            <w:shd w:fill="F2F5F9"/>
+          </w:tcPr>
+          <w:p>
+            <w:pPr>
+              <w:spacing w:after="40" w:before="40"/>
+            </w:pPr>
+            <w:r>
+              <w:rPr>
+                <w:rFonts w:ascii="Calibri" w:hAnsi="Calibri"/>
+                <w:sz w:val="19"/>
+              </w:rPr>
+              <w:t>UCI &amp; Framingham</w:t>
+            </w:r>
+          </w:p>
+        </w:tc>
+        <w:tc>
+          <w:tcPr>
+            <w:tcW w:type="dxa" w:w="1152"/>
+            <w:shd w:fill="F2F5F9"/>
+          </w:tcPr>
+          <w:p>
+            <w:pPr>
+              <w:spacing w:after="40" w:before="40"/>
+            </w:pPr>
+            <w:r>
+              <w:rPr>
+                <w:rFonts w:ascii="Calibri" w:hAnsi="Calibri"/>
+                <w:sz w:val="19"/>
+              </w:rPr>
+              <w:t>Shreyas</w:t>
+            </w:r>
+          </w:p>
+        </w:tc>
+      </w:tr>
+      <w:tr>
+        <w:tc>
+          <w:tcPr>
+            <w:tcW w:type="dxa" w:w="720"/>
+            <w:shd w:fill="FFFFFF"/>
+          </w:tcPr>
+          <w:p>
+            <w:pPr>
+              <w:spacing w:after="40" w:before="40"/>
+            </w:pPr>
+            <w:r>
+              <w:rPr>
+                <w:rFonts w:ascii="Calibri" w:hAnsi="Calibri"/>
+                <w:sz w:val="19"/>
+              </w:rPr>
+              <w:t>11</w:t>
+            </w:r>
+          </w:p>
+        </w:tc>
+        <w:tc>
+          <w:tcPr>
+            <w:tcW w:type="dxa" w:w="1728"/>
+            <w:shd w:fill="FFFFFF"/>
+          </w:tcPr>
+          <w:p>
+            <w:pPr>
+              <w:spacing w:after="40" w:before="40"/>
+            </w:pPr>
+            <w:r>
+              <w:rPr>
+                <w:rFonts w:ascii="Calibri" w:hAnsi="Calibri"/>
+                <w:sz w:val="19"/>
+              </w:rPr>
+              <w:t>Alotaibi (2019)</w:t>
+            </w:r>
+          </w:p>
+        </w:tc>
+        <w:tc>
+          <w:tcPr>
+            <w:tcW w:type="dxa" w:w="3168"/>
+            <w:shd w:fill="FFFFFF"/>
+          </w:tcPr>
+          <w:p>
+            <w:pPr>
+              <w:spacing w:after="40" w:before="40"/>
+            </w:pPr>
+            <w:r>
+              <w:rPr>
+                <w:rFonts w:ascii="Calibri" w:hAnsi="Calibri"/>
+                <w:sz w:val="19"/>
+              </w:rPr>
+              <w:t>Implementation of Machine Learning Model to Predict...</w:t>
+            </w:r>
+          </w:p>
+        </w:tc>
+        <w:tc>
+          <w:tcPr>
+            <w:tcW w:type="dxa" w:w="1872"/>
+            <w:shd w:fill="FFFFFF"/>
+          </w:tcPr>
+          <w:p>
+            <w:pPr>
+              <w:spacing w:after="40" w:before="40"/>
+            </w:pPr>
+            <w:r>
+              <w:rPr>
+                <w:rFonts w:ascii="Calibri" w:hAnsi="Calibri"/>
+                <w:sz w:val="19"/>
+              </w:rPr>
+              <w:t>IJACSA (SAI)</w:t>
+            </w:r>
+          </w:p>
+        </w:tc>
+        <w:tc>
+          <w:tcPr>
+            <w:tcW w:type="dxa" w:w="2016"/>
+            <w:shd w:fill="FFFFFF"/>
+          </w:tcPr>
+          <w:p>
+            <w:pPr>
+              <w:spacing w:after="40" w:before="40"/>
+            </w:pPr>
+            <w:r>
+              <w:rPr>
+                <w:rFonts w:ascii="Calibri" w:hAnsi="Calibri"/>
+                <w:sz w:val="19"/>
+              </w:rPr>
+              <w:t>Deep Neural Network (ANN)</w:t>
+            </w:r>
+          </w:p>
+        </w:tc>
+        <w:tc>
+          <w:tcPr>
+            <w:tcW w:type="dxa" w:w="1296"/>
+            <w:shd w:fill="FFFFFF"/>
+          </w:tcPr>
+          <w:p>
+            <w:pPr>
+              <w:spacing w:after="40" w:before="40"/>
+            </w:pPr>
+            <w:r>
+              <w:rPr>
+                <w:rFonts w:ascii="Calibri" w:hAnsi="Calibri"/>
+                <w:sz w:val="19"/>
+              </w:rPr>
+              <w:t>UCI Cleveland</w:t>
+            </w:r>
+          </w:p>
+        </w:tc>
+        <w:tc>
+          <w:tcPr>
+            <w:tcW w:type="dxa" w:w="1152"/>
+            <w:shd w:fill="FFFFFF"/>
+          </w:tcPr>
+          <w:p>
+            <w:pPr>
+              <w:spacing w:after="40" w:before="40"/>
+            </w:pPr>
+            <w:r>
+              <w:rPr>
+                <w:rFonts w:ascii="Calibri" w:hAnsi="Calibri"/>
+                <w:sz w:val="19"/>
+              </w:rPr>
+              <w:t>Uday</w:t>
+            </w:r>
+          </w:p>
+        </w:tc>
+      </w:tr>
+      <w:tr>
+        <w:tc>
+          <w:tcPr>
+            <w:tcW w:type="dxa" w:w="720"/>
+            <w:shd w:fill="F2F5F9"/>
+          </w:tcPr>
+          <w:p>
+            <w:pPr>
+              <w:spacing w:after="40" w:before="40"/>
+            </w:pPr>
+            <w:r>
+              <w:rPr>
+                <w:rFonts w:ascii="Calibri" w:hAnsi="Calibri"/>
+                <w:sz w:val="19"/>
+              </w:rPr>
+              <w:t>12</w:t>
+            </w:r>
+          </w:p>
+        </w:tc>
+        <w:tc>
+          <w:tcPr>
+            <w:tcW w:type="dxa" w:w="1728"/>
+            <w:shd w:fill="F2F5F9"/>
+          </w:tcPr>
+          <w:p>
+            <w:pPr>
+              <w:spacing w:after="40" w:before="40"/>
+            </w:pPr>
+            <w:r>
+              <w:rPr>
+                <w:rFonts w:ascii="Calibri" w:hAnsi="Calibri"/>
+                <w:sz w:val="19"/>
+              </w:rPr>
+              <w:t>Pan et al. (2020)</w:t>
+            </w:r>
+          </w:p>
+        </w:tc>
+        <w:tc>
+          <w:tcPr>
+            <w:tcW w:type="dxa" w:w="3168"/>
+            <w:shd w:fill="F2F5F9"/>
+          </w:tcPr>
+          <w:p>
+            <w:pPr>
+              <w:spacing w:after="40" w:before="40"/>
+            </w:pPr>
+            <w:r>
+              <w:rPr>
+                <w:rFonts w:ascii="Calibri" w:hAnsi="Calibri"/>
+                <w:sz w:val="19"/>
+              </w:rPr>
+              <w:t>Enhanced Deep Learning Assisted Convolutional Neural Network...</w:t>
+            </w:r>
+          </w:p>
+        </w:tc>
+        <w:tc>
+          <w:tcPr>
+            <w:tcW w:type="dxa" w:w="1872"/>
+            <w:shd w:fill="F2F5F9"/>
+          </w:tcPr>
+          <w:p>
+            <w:pPr>
+              <w:spacing w:after="40" w:before="40"/>
+            </w:pPr>
+            <w:r>
+              <w:rPr>
+                <w:rFonts w:ascii="Calibri" w:hAnsi="Calibri"/>
+                <w:sz w:val="19"/>
+              </w:rPr>
+              <w:t>IEEE Access (IEEE)</w:t>
+            </w:r>
+          </w:p>
+        </w:tc>
+        <w:tc>
+          <w:tcPr>
+            <w:tcW w:type="dxa" w:w="2016"/>
+            <w:shd w:fill="F2F5F9"/>
+          </w:tcPr>
+          <w:p>
+            <w:pPr>
+              <w:spacing w:after="40" w:before="40"/>
+            </w:pPr>
+            <w:r>
+              <w:rPr>
+                <w:rFonts w:ascii="Calibri" w:hAnsi="Calibri"/>
+                <w:sz w:val="19"/>
+              </w:rPr>
+              <w:t>1D-CNN IoMT Risk Model</w:t>
+            </w:r>
+          </w:p>
+        </w:tc>
+        <w:tc>
+          <w:tcPr>
+            <w:tcW w:type="dxa" w:w="1296"/>
+            <w:shd w:fill="F2F5F9"/>
+          </w:tcPr>
+          <w:p>
+            <w:pPr>
+              <w:spacing w:after="40" w:before="40"/>
+            </w:pPr>
+            <w:r>
+              <w:rPr>
+                <w:rFonts w:ascii="Calibri" w:hAnsi="Calibri"/>
+                <w:sz w:val="19"/>
+              </w:rPr>
+              <w:t>UCI &amp; IoMT Data</w:t>
+            </w:r>
+          </w:p>
+        </w:tc>
+        <w:tc>
+          <w:tcPr>
+            <w:tcW w:type="dxa" w:w="1152"/>
+            <w:shd w:fill="F2F5F9"/>
+          </w:tcPr>
+          <w:p>
+            <w:pPr>
+              <w:spacing w:after="40" w:before="40"/>
+            </w:pPr>
+            <w:r>
+              <w:rPr>
+                <w:rFonts w:ascii="Calibri" w:hAnsi="Calibri"/>
+                <w:sz w:val="19"/>
+              </w:rPr>
+              <w:t>Uday</w:t>
+            </w:r>
+          </w:p>
+        </w:tc>
+      </w:tr>
+      <w:tr>
+        <w:tc>
+          <w:tcPr>
+            <w:tcW w:type="dxa" w:w="720"/>
+            <w:shd w:fill="FFFFFF"/>
+          </w:tcPr>
+          <w:p>
+            <w:pPr>
+              <w:spacing w:after="40" w:before="40"/>
+            </w:pPr>
+            <w:r>
+              <w:rPr>
+                <w:rFonts w:ascii="Calibri" w:hAnsi="Calibri"/>
+                <w:sz w:val="19"/>
+              </w:rPr>
+              <w:t>13</w:t>
+            </w:r>
+          </w:p>
+        </w:tc>
+        <w:tc>
+          <w:tcPr>
+            <w:tcW w:type="dxa" w:w="1728"/>
+            <w:shd w:fill="FFFFFF"/>
+          </w:tcPr>
+          <w:p>
+            <w:pPr>
+              <w:spacing w:after="40" w:before="40"/>
+            </w:pPr>
+            <w:r>
+              <w:rPr>
+                <w:rFonts w:ascii="Calibri" w:hAnsi="Calibri"/>
+                <w:sz w:val="19"/>
+              </w:rPr>
+              <w:t>Dissanayake &amp; Johar (2021)</w:t>
+            </w:r>
+          </w:p>
+        </w:tc>
+        <w:tc>
+          <w:tcPr>
+            <w:tcW w:type="dxa" w:w="3168"/>
+            <w:shd w:fill="FFFFFF"/>
+          </w:tcPr>
+          <w:p>
+            <w:pPr>
+              <w:spacing w:after="40" w:before="40"/>
+            </w:pPr>
+            <w:r>
+              <w:rPr>
+                <w:rFonts w:ascii="Calibri" w:hAnsi="Calibri"/>
+                <w:sz w:val="19"/>
+              </w:rPr>
+              <w:t>Comparative Study on Heart Disease Prediction Using...</w:t>
+            </w:r>
+          </w:p>
+        </w:tc>
+        <w:tc>
+          <w:tcPr>
+            <w:tcW w:type="dxa" w:w="1872"/>
+            <w:shd w:fill="FFFFFF"/>
+          </w:tcPr>
+          <w:p>
+            <w:pPr>
+              <w:spacing w:after="40" w:before="40"/>
+            </w:pPr>
+            <w:r>
+              <w:rPr>
+                <w:rFonts w:ascii="Calibri" w:hAnsi="Calibri"/>
+                <w:sz w:val="19"/>
+              </w:rPr>
+              <w:t>Appl Comput Intell (Wiley)</w:t>
+            </w:r>
+          </w:p>
+        </w:tc>
+        <w:tc>
+          <w:tcPr>
+            <w:tcW w:type="dxa" w:w="2016"/>
+            <w:shd w:fill="FFFFFF"/>
+          </w:tcPr>
+          <w:p>
+            <w:pPr>
+              <w:spacing w:after="40" w:before="40"/>
+            </w:pPr>
+            <w:r>
+              <w:rPr>
+                <w:rFonts w:ascii="Calibri" w:hAnsi="Calibri"/>
+                <w:sz w:val="19"/>
+              </w:rPr>
+              <w:t>MLP &amp; Feature Selection</w:t>
+            </w:r>
+          </w:p>
+        </w:tc>
+        <w:tc>
+          <w:tcPr>
+            <w:tcW w:type="dxa" w:w="1296"/>
+            <w:shd w:fill="FFFFFF"/>
+          </w:tcPr>
+          <w:p>
+            <w:pPr>
+              <w:spacing w:after="40" w:before="40"/>
+            </w:pPr>
+            <w:r>
+              <w:rPr>
+                <w:rFonts w:ascii="Calibri" w:hAnsi="Calibri"/>
+                <w:sz w:val="19"/>
+              </w:rPr>
+              <w:t>UCI Cleveland</w:t>
+            </w:r>
+          </w:p>
+        </w:tc>
+        <w:tc>
+          <w:tcPr>
+            <w:tcW w:type="dxa" w:w="1152"/>
+            <w:shd w:fill="FFFFFF"/>
+          </w:tcPr>
+          <w:p>
+            <w:pPr>
+              <w:spacing w:after="40" w:before="40"/>
+            </w:pPr>
+            <w:r>
+              <w:rPr>
+                <w:rFonts w:ascii="Calibri" w:hAnsi="Calibri"/>
+                <w:sz w:val="19"/>
+              </w:rPr>
+              <w:t>Suprith</w:t>
+            </w:r>
+          </w:p>
+        </w:tc>
+      </w:tr>
+      <w:tr>
+        <w:tc>
+          <w:tcPr>
+            <w:tcW w:type="dxa" w:w="720"/>
+            <w:shd w:fill="F2F5F9"/>
+          </w:tcPr>
+          <w:p>
+            <w:pPr>
+              <w:spacing w:after="40" w:before="40"/>
+            </w:pPr>
+            <w:r>
+              <w:rPr>
+                <w:rFonts w:ascii="Calibri" w:hAnsi="Calibri"/>
+                <w:sz w:val="19"/>
+              </w:rPr>
+              <w:t>14</w:t>
+            </w:r>
+          </w:p>
+        </w:tc>
+        <w:tc>
+          <w:tcPr>
+            <w:tcW w:type="dxa" w:w="1728"/>
+            <w:shd w:fill="F2F5F9"/>
+          </w:tcPr>
+          <w:p>
+            <w:pPr>
+              <w:spacing w:after="40" w:before="40"/>
+            </w:pPr>
+            <w:r>
+              <w:rPr>
+                <w:rFonts w:ascii="Calibri" w:hAnsi="Calibri"/>
+                <w:sz w:val="19"/>
+              </w:rPr>
+              <w:t>Mehmood et al. (2021)</w:t>
+            </w:r>
+          </w:p>
+        </w:tc>
+        <w:tc>
+          <w:tcPr>
+            <w:tcW w:type="dxa" w:w="3168"/>
+            <w:shd w:fill="F2F5F9"/>
+          </w:tcPr>
+          <w:p>
+            <w:pPr>
+              <w:spacing w:after="40" w:before="40"/>
+            </w:pPr>
+            <w:r>
+              <w:rPr>
+                <w:rFonts w:ascii="Calibri" w:hAnsi="Calibri"/>
+                <w:sz w:val="19"/>
+              </w:rPr>
+              <w:t>Prediction of heart disease using deep convolutional...</w:t>
+            </w:r>
+          </w:p>
+        </w:tc>
+        <w:tc>
+          <w:tcPr>
+            <w:tcW w:type="dxa" w:w="1872"/>
+            <w:shd w:fill="F2F5F9"/>
+          </w:tcPr>
+          <w:p>
+            <w:pPr>
+              <w:spacing w:after="40" w:before="40"/>
+            </w:pPr>
+            <w:r>
+              <w:rPr>
+                <w:rFonts w:ascii="Calibri" w:hAnsi="Calibri"/>
+                <w:sz w:val="19"/>
+              </w:rPr>
+              <w:t>Arab Sci Eng (Springer)</w:t>
+            </w:r>
+          </w:p>
+        </w:tc>
+        <w:tc>
+          <w:tcPr>
+            <w:tcW w:type="dxa" w:w="2016"/>
+            <w:shd w:fill="F2F5F9"/>
+          </w:tcPr>
+          <w:p>
+            <w:pPr>
+              <w:spacing w:after="40" w:before="40"/>
+            </w:pPr>
+            <w:r>
+              <w:rPr>
+                <w:rFonts w:ascii="Calibri" w:hAnsi="Calibri"/>
+                <w:sz w:val="19"/>
+              </w:rPr>
+              <w:t>2D-Mapped CNN Classifier</w:t>
+            </w:r>
+          </w:p>
+        </w:tc>
+        <w:tc>
+          <w:tcPr>
+            <w:tcW w:type="dxa" w:w="1296"/>
+            <w:shd w:fill="F2F5F9"/>
+          </w:tcPr>
+          <w:p>
+            <w:pPr>
+              <w:spacing w:after="40" w:before="40"/>
+            </w:pPr>
+            <w:r>
+              <w:rPr>
+                <w:rFonts w:ascii="Calibri" w:hAnsi="Calibri"/>
+                <w:sz w:val="19"/>
+              </w:rPr>
+              <w:t>UCI Cleveland</w:t>
+            </w:r>
+          </w:p>
+        </w:tc>
+        <w:tc>
+          <w:tcPr>
+            <w:tcW w:type="dxa" w:w="1152"/>
+            <w:shd w:fill="F2F5F9"/>
+          </w:tcPr>
+          <w:p>
+            <w:pPr>
+              <w:spacing w:after="40" w:before="40"/>
+            </w:pPr>
+            <w:r>
+              <w:rPr>
+                <w:rFonts w:ascii="Calibri" w:hAnsi="Calibri"/>
+                <w:sz w:val="19"/>
+              </w:rPr>
+              <w:t>Suprith</w:t>
+            </w:r>
+          </w:p>
+        </w:tc>
+      </w:tr>
+      <w:tr>
+        <w:tc>
+          <w:tcPr>
+            <w:tcW w:type="dxa" w:w="720"/>
+            <w:shd w:fill="FFFFFF"/>
+          </w:tcPr>
+          <w:p>
+            <w:pPr>
+              <w:spacing w:after="40" w:before="40"/>
+            </w:pPr>
+            <w:r>
+              <w:rPr>
+                <w:rFonts w:ascii="Calibri" w:hAnsi="Calibri"/>
+                <w:sz w:val="19"/>
+              </w:rPr>
+              <w:t>15</w:t>
+            </w:r>
+          </w:p>
+        </w:tc>
+        <w:tc>
+          <w:tcPr>
+            <w:tcW w:type="dxa" w:w="1728"/>
+            <w:shd w:fill="FFFFFF"/>
+          </w:tcPr>
+          <w:p>
+            <w:pPr>
+              <w:spacing w:after="40" w:before="40"/>
+            </w:pPr>
+            <w:r>
+              <w:rPr>
+                <w:rFonts w:ascii="Calibri" w:hAnsi="Calibri"/>
+                <w:sz w:val="19"/>
+              </w:rPr>
+              <w:t>Sarra et al. (2022)</w:t>
+            </w:r>
+          </w:p>
+        </w:tc>
+        <w:tc>
+          <w:tcPr>
+            <w:tcW w:type="dxa" w:w="3168"/>
+            <w:shd w:fill="FFFFFF"/>
+          </w:tcPr>
+          <w:p>
+            <w:pPr>
+              <w:spacing w:after="40" w:before="40"/>
+            </w:pPr>
+            <w:r>
+              <w:rPr>
+                <w:rFonts w:ascii="Calibri" w:hAnsi="Calibri"/>
+                <w:sz w:val="19"/>
+              </w:rPr>
+              <w:t>A Robust Framework for Data Generative and Heart Disease...</w:t>
+            </w:r>
+          </w:p>
+        </w:tc>
+        <w:tc>
+          <w:tcPr>
+            <w:tcW w:type="dxa" w:w="1872"/>
+            <w:shd w:fill="FFFFFF"/>
+          </w:tcPr>
+          <w:p>
+            <w:pPr>
+              <w:spacing w:after="40" w:before="40"/>
+            </w:pPr>
+            <w:r>
+              <w:rPr>
+                <w:rFonts w:ascii="Calibri" w:hAnsi="Calibri"/>
+                <w:sz w:val="19"/>
+              </w:rPr>
+              <w:t>Diagnostics (MDPI)</w:t>
+            </w:r>
+          </w:p>
+        </w:tc>
+        <w:tc>
+          <w:tcPr>
+            <w:tcW w:type="dxa" w:w="2016"/>
+            <w:shd w:fill="FFFFFF"/>
+          </w:tcPr>
+          <w:p>
+            <w:pPr>
+              <w:spacing w:after="40" w:before="40"/>
+            </w:pPr>
+            <w:r>
+              <w:rPr>
+                <w:rFonts w:ascii="Calibri" w:hAnsi="Calibri"/>
+                <w:sz w:val="19"/>
+              </w:rPr>
+              <w:t>GAN-Enhanced Deep Neural Net</w:t>
+            </w:r>
+          </w:p>
+        </w:tc>
+        <w:tc>
+          <w:tcPr>
+            <w:tcW w:type="dxa" w:w="1296"/>
+            <w:shd w:fill="FFFFFF"/>
+          </w:tcPr>
+          <w:p>
+            <w:pPr>
+              <w:spacing w:after="40" w:before="40"/>
+            </w:pPr>
+            <w:r>
+              <w:rPr>
+                <w:rFonts w:ascii="Calibri" w:hAnsi="Calibri"/>
+                <w:sz w:val="19"/>
+              </w:rPr>
+              <w:t>UCI Cleveland</w:t>
+            </w:r>
+          </w:p>
+        </w:tc>
+        <w:tc>
+          <w:tcPr>
+            <w:tcW w:type="dxa" w:w="1152"/>
+            <w:shd w:fill="FFFFFF"/>
+          </w:tcPr>
+          <w:p>
+            <w:pPr>
+              <w:spacing w:after="40" w:before="40"/>
+            </w:pPr>
+            <w:r>
+              <w:rPr>
+                <w:rFonts w:ascii="Calibri" w:hAnsi="Calibri"/>
+                <w:sz w:val="19"/>
+              </w:rPr>
+              <w:t>Sahitya</w:t>
+            </w:r>
+          </w:p>
+        </w:tc>
+      </w:tr>
+      <w:tr>
+        <w:tc>
+          <w:tcPr>
+            <w:tcW w:type="dxa" w:w="720"/>
+            <w:shd w:fill="F2F5F9"/>
+          </w:tcPr>
+          <w:p>
+            <w:pPr>
+              <w:spacing w:after="40" w:before="40"/>
+            </w:pPr>
+            <w:r>
+              <w:rPr>
+                <w:rFonts w:ascii="Calibri" w:hAnsi="Calibri"/>
+                <w:sz w:val="19"/>
+              </w:rPr>
+              <w:t>16</w:t>
+            </w:r>
+          </w:p>
+        </w:tc>
+        <w:tc>
+          <w:tcPr>
+            <w:tcW w:type="dxa" w:w="1728"/>
+            <w:shd w:fill="F2F5F9"/>
+          </w:tcPr>
+          <w:p>
+            <w:pPr>
+              <w:spacing w:after="40" w:before="40"/>
+            </w:pPr>
+            <w:r>
+              <w:rPr>
+                <w:rFonts w:ascii="Calibri" w:hAnsi="Calibri"/>
+                <w:sz w:val="19"/>
+              </w:rPr>
+              <w:t>Al-Makhadmeh &amp; Tolba (2019)</w:t>
+            </w:r>
+          </w:p>
+        </w:tc>
+        <w:tc>
+          <w:tcPr>
+            <w:tcW w:type="dxa" w:w="3168"/>
+            <w:shd w:fill="F2F5F9"/>
+          </w:tcPr>
+          <w:p>
+            <w:pPr>
+              <w:spacing w:after="40" w:before="40"/>
+            </w:pPr>
+            <w:r>
+              <w:rPr>
+                <w:rFonts w:ascii="Calibri" w:hAnsi="Calibri"/>
+                <w:sz w:val="19"/>
+              </w:rPr>
+              <w:t>Utilizing IoT wearable medical device for heart disease...</w:t>
+            </w:r>
+          </w:p>
+        </w:tc>
+        <w:tc>
+          <w:tcPr>
+            <w:tcW w:type="dxa" w:w="1872"/>
+            <w:shd w:fill="F2F5F9"/>
+          </w:tcPr>
+          <w:p>
+            <w:pPr>
+              <w:spacing w:after="40" w:before="40"/>
+            </w:pPr>
+            <w:r>
+              <w:rPr>
+                <w:rFonts w:ascii="Calibri" w:hAnsi="Calibri"/>
+                <w:sz w:val="19"/>
+              </w:rPr>
+              <w:t>Measurement (Elsevier)</w:t>
+            </w:r>
+          </w:p>
+        </w:tc>
+        <w:tc>
+          <w:tcPr>
+            <w:tcW w:type="dxa" w:w="2016"/>
+            <w:shd w:fill="F2F5F9"/>
+          </w:tcPr>
+          <w:p>
+            <w:pPr>
+              <w:spacing w:after="40" w:before="40"/>
+            </w:pPr>
+            <w:r>
+              <w:rPr>
+                <w:rFonts w:ascii="Calibri" w:hAnsi="Calibri"/>
+                <w:sz w:val="19"/>
+              </w:rPr>
+              <w:t>Higher-Order Boltzmann Machine</w:t>
+            </w:r>
+          </w:p>
+        </w:tc>
+        <w:tc>
+          <w:tcPr>
+            <w:tcW w:type="dxa" w:w="1296"/>
+            <w:shd w:fill="F2F5F9"/>
+          </w:tcPr>
+          <w:p>
+            <w:pPr>
+              <w:spacing w:after="40" w:before="40"/>
+            </w:pPr>
+            <w:r>
+              <w:rPr>
+                <w:rFonts w:ascii="Calibri" w:hAnsi="Calibri"/>
+                <w:sz w:val="19"/>
+              </w:rPr>
+              <w:t>UCI &amp; IoT Data</w:t>
+            </w:r>
+          </w:p>
+        </w:tc>
+        <w:tc>
+          <w:tcPr>
+            <w:tcW w:type="dxa" w:w="1152"/>
+            <w:shd w:fill="F2F5F9"/>
+          </w:tcPr>
+          <w:p>
+            <w:pPr>
+              <w:spacing w:after="40" w:before="40"/>
+            </w:pPr>
+            <w:r>
+              <w:rPr>
+                <w:rFonts w:ascii="Calibri" w:hAnsi="Calibri"/>
+                <w:sz w:val="19"/>
+              </w:rPr>
+              <w:t>Sahitya</w:t>
+            </w:r>
+          </w:p>
+        </w:tc>
+      </w:tr>
+    </w:tbl>
+    <w:p>
+      <w:pPr>
+        <w:keepNext/>
+        <w:spacing w:before="200" w:after="80"/>
+      </w:pPr>
+      <w:r>
+        <w:rPr>
+          <w:rFonts w:ascii="Arial" w:hAnsi="Arial"/>
+          <w:b/>
+          <w:color w:val="4B6B94"/>
+          <w:sz w:val="26"/>
+        </w:rPr>
+        <w:t>3.3 Research Gap Analysis &amp; Team Allocation</w:t>
+      </w:r>
+    </w:p>
+    <w:p>
+      <w:pPr>
+        <w:spacing w:before="0" w:after="120" w:line="276" w:lineRule="auto"/>
+      </w:pPr>
+      <w:r>
+        <w:rPr>
+          <w:rFonts w:ascii="Calibri" w:hAnsi="Calibri"/>
+          <w:sz w:val="22"/>
+        </w:rPr>
+        <w:t>Common research gaps identified across the literature include: (1) small sample size constraints on deep network tuning, (2) single-dataset evaluation without external validation, (3) black-box opacity in deep neural networks, and (4) absence of deployed interactive application interfaces.</w:t>
+      </w:r>
+    </w:p>
+    <w:p>
+      <w:pPr>
+        <w:spacing w:before="0" w:after="120" w:line="276" w:lineRule="auto"/>
+      </w:pPr>
+      <w:r>
+        <w:rPr>
+          <w:rFonts w:ascii="Calibri" w:hAnsi="Calibri"/>
+          <w:sz w:val="22"/>
+        </w:rPr>
+        <w:t>Our capstone project directly addresses these gaps by establishing a leak-free multi-model benchmark, priority recall evaluation, feature importance interpretability, and interactive Streamlit web deployment.</w:t>
+      </w:r>
+    </w:p>
+    <w:tbl>
+      <w:tblPr>
+        <w:tblW w:type="auto" w:w="0"/>
+        <w:jc w:val="center"/>
+        <w:tblLook w:firstColumn="1" w:firstRow="1" w:lastColumn="0" w:lastRow="0" w:noHBand="0" w:noVBand="1" w:val="04A0"/>
+      </w:tblPr>
+      <w:tblGrid>
+        <w:gridCol w:w="2340"/>
+        <w:gridCol w:w="2340"/>
+        <w:gridCol w:w="2340"/>
+        <w:gridCol w:w="2340"/>
+      </w:tblGrid>
+      <w:tr>
+        <w:tc>
+          <w:tcPr>
+            <w:tcW w:type="dxa" w:w="1728"/>
+            <w:shd w:fill="1B365D"/>
+          </w:tcPr>
+          <w:p>
+            <w:pPr>
+              <w:jc w:val="center"/>
+            </w:pPr>
+            <w:r>
+              <w:rPr>
+                <w:rFonts w:ascii="Arial" w:hAnsi="Arial"/>
+                <w:b/>
+                <w:color w:val="FFFFFF"/>
+                <w:sz w:val="19"/>
+              </w:rPr>
+              <w:t>Team Member</w:t>
+            </w:r>
+          </w:p>
+        </w:tc>
+        <w:tc>
+          <w:tcPr>
+            <w:tcW w:type="dxa" w:w="3600"/>
+            <w:shd w:fill="1B365D"/>
+          </w:tcPr>
+          <w:p>
+            <w:pPr>
+              <w:jc w:val="center"/>
+            </w:pPr>
+            <w:r>
+              <w:rPr>
+                <w:rFonts w:ascii="Arial" w:hAnsi="Arial"/>
+                <w:b/>
+                <w:color w:val="FFFFFF"/>
+                <w:sz w:val="19"/>
+              </w:rPr>
+              <w:t>ML Papers Assigned</w:t>
+            </w:r>
+          </w:p>
+        </w:tc>
+        <w:tc>
+          <w:tcPr>
+            <w:tcW w:type="dxa" w:w="3600"/>
+            <w:shd w:fill="1B365D"/>
+          </w:tcPr>
+          <w:p>
+            <w:pPr>
+              <w:jc w:val="center"/>
+            </w:pPr>
+            <w:r>
+              <w:rPr>
+                <w:rFonts w:ascii="Arial" w:hAnsi="Arial"/>
+                <w:b/>
+                <w:color w:val="FFFFFF"/>
+                <w:sz w:val="19"/>
+              </w:rPr>
+              <w:t>DL Papers Assigned</w:t>
+            </w:r>
+          </w:p>
+        </w:tc>
+        <w:tc>
+          <w:tcPr>
+            <w:tcW w:type="dxa" w:w="1440"/>
+            <w:shd w:fill="1B365D"/>
+          </w:tcPr>
+          <w:p>
+            <w:pPr>
+              <w:jc w:val="center"/>
+            </w:pPr>
+            <w:r>
+              <w:rPr>
+                <w:rFonts w:ascii="Arial" w:hAnsi="Arial"/>
+                <w:b/>
+                <w:color w:val="FFFFFF"/>
+                <w:sz w:val="19"/>
+              </w:rPr>
+              <w:t>Total Papers</w:t>
+            </w:r>
+          </w:p>
+        </w:tc>
+      </w:tr>
+      <w:tr>
+        <w:tc>
+          <w:tcPr>
+            <w:tcW w:type="dxa" w:w="1728"/>
+            <w:shd w:fill="FFFFFF"/>
+          </w:tcPr>
+          <w:p>
+            <w:pPr>
+              <w:spacing w:after="40" w:before="40"/>
+            </w:pPr>
+            <w:r>
+              <w:rPr>
+                <w:rFonts w:ascii="Calibri" w:hAnsi="Calibri"/>
+                <w:sz w:val="19"/>
+              </w:rPr>
+              <w:t>Shreyas</w:t>
+            </w:r>
+          </w:p>
+        </w:tc>
+        <w:tc>
+          <w:tcPr>
+            <w:tcW w:type="dxa" w:w="3600"/>
+            <w:shd w:fill="FFFFFF"/>
+          </w:tcPr>
+          <w:p>
+            <w:pPr>
+              <w:spacing w:after="40" w:before="40"/>
+            </w:pPr>
+            <w:r>
+              <w:rPr>
+                <w:rFonts w:ascii="Calibri" w:hAnsi="Calibri"/>
+                <w:sz w:val="19"/>
+              </w:rPr>
+              <w:t>Detrano et al. (1989), Palaniappan &amp; Awang (2008)</w:t>
+            </w:r>
+          </w:p>
+        </w:tc>
+        <w:tc>
+          <w:tcPr>
+            <w:tcW w:type="dxa" w:w="3600"/>
+            <w:shd w:fill="FFFFFF"/>
+          </w:tcPr>
+          <w:p>
+            <w:pPr>
+              <w:spacing w:after="40" w:before="40"/>
+            </w:pPr>
+            <w:r>
+              <w:rPr>
+                <w:rFonts w:ascii="Calibri" w:hAnsi="Calibri"/>
+                <w:sz w:val="19"/>
+              </w:rPr>
+              <w:t>Mienye et al. (2020), Ali et al. (2020)</w:t>
+            </w:r>
+          </w:p>
+        </w:tc>
+        <w:tc>
+          <w:tcPr>
+            <w:tcW w:type="dxa" w:w="1440"/>
+            <w:shd w:fill="FFFFFF"/>
+          </w:tcPr>
+          <w:p>
+            <w:pPr>
+              <w:spacing w:after="40" w:before="40"/>
+            </w:pPr>
+            <w:r>
+              <w:rPr>
+                <w:rFonts w:ascii="Calibri" w:hAnsi="Calibri"/>
+                <w:sz w:val="19"/>
+              </w:rPr>
+              <w:t>4</w:t>
+            </w:r>
+          </w:p>
+        </w:tc>
+      </w:tr>
+      <w:tr>
+        <w:tc>
+          <w:tcPr>
+            <w:tcW w:type="dxa" w:w="1728"/>
+            <w:shd w:fill="F2F5F9"/>
+          </w:tcPr>
+          <w:p>
+            <w:pPr>
+              <w:spacing w:after="40" w:before="40"/>
+            </w:pPr>
+            <w:r>
+              <w:rPr>
+                <w:rFonts w:ascii="Calibri" w:hAnsi="Calibri"/>
+                <w:sz w:val="19"/>
+              </w:rPr>
+              <w:t>Uday</w:t>
+            </w:r>
+          </w:p>
+        </w:tc>
+        <w:tc>
+          <w:tcPr>
+            <w:tcW w:type="dxa" w:w="3600"/>
+            <w:shd w:fill="F2F5F9"/>
+          </w:tcPr>
+          <w:p>
+            <w:pPr>
+              <w:spacing w:after="40" w:before="40"/>
+            </w:pPr>
+            <w:r>
+              <w:rPr>
+                <w:rFonts w:ascii="Calibri" w:hAnsi="Calibri"/>
+                <w:sz w:val="19"/>
+              </w:rPr>
+              <w:t>Anooj (2012), Arabasadi et al. (2017)</w:t>
+            </w:r>
+          </w:p>
+        </w:tc>
+        <w:tc>
+          <w:tcPr>
+            <w:tcW w:type="dxa" w:w="3600"/>
+            <w:shd w:fill="F2F5F9"/>
+          </w:tcPr>
+          <w:p>
+            <w:pPr>
+              <w:spacing w:after="40" w:before="40"/>
+            </w:pPr>
+            <w:r>
+              <w:rPr>
+                <w:rFonts w:ascii="Calibri" w:hAnsi="Calibri"/>
+                <w:sz w:val="19"/>
+              </w:rPr>
+              <w:t>Alotaibi (2019), Pan et al. (2020)</w:t>
+            </w:r>
+          </w:p>
+        </w:tc>
+        <w:tc>
+          <w:tcPr>
+            <w:tcW w:type="dxa" w:w="1440"/>
+            <w:shd w:fill="F2F5F9"/>
+          </w:tcPr>
+          <w:p>
+            <w:pPr>
+              <w:spacing w:after="40" w:before="40"/>
+            </w:pPr>
+            <w:r>
+              <w:rPr>
+                <w:rFonts w:ascii="Calibri" w:hAnsi="Calibri"/>
+                <w:sz w:val="19"/>
+              </w:rPr>
+              <w:t>4</w:t>
+            </w:r>
+          </w:p>
+        </w:tc>
+      </w:tr>
+      <w:tr>
+        <w:tc>
+          <w:tcPr>
+            <w:tcW w:type="dxa" w:w="1728"/>
+            <w:shd w:fill="FFFFFF"/>
+          </w:tcPr>
+          <w:p>
+            <w:pPr>
+              <w:spacing w:after="40" w:before="40"/>
+            </w:pPr>
+            <w:r>
+              <w:rPr>
+                <w:rFonts w:ascii="Calibri" w:hAnsi="Calibri"/>
+                <w:sz w:val="19"/>
+              </w:rPr>
+              <w:t>Suprith</w:t>
+            </w:r>
+          </w:p>
+        </w:tc>
+        <w:tc>
+          <w:tcPr>
+            <w:tcW w:type="dxa" w:w="3600"/>
+            <w:shd w:fill="FFFFFF"/>
+          </w:tcPr>
+          <w:p>
+            <w:pPr>
+              <w:spacing w:after="40" w:before="40"/>
+            </w:pPr>
+            <w:r>
+              <w:rPr>
+                <w:rFonts w:ascii="Calibri" w:hAnsi="Calibri"/>
+                <w:sz w:val="19"/>
+              </w:rPr>
+              <w:t>Haq et al. (2018), Mohan et al. (2019)</w:t>
+            </w:r>
+          </w:p>
+        </w:tc>
+        <w:tc>
+          <w:tcPr>
+            <w:tcW w:type="dxa" w:w="3600"/>
+            <w:shd w:fill="FFFFFF"/>
+          </w:tcPr>
+          <w:p>
+            <w:pPr>
+              <w:spacing w:after="40" w:before="40"/>
+            </w:pPr>
+            <w:r>
+              <w:rPr>
+                <w:rFonts w:ascii="Calibri" w:hAnsi="Calibri"/>
+                <w:sz w:val="19"/>
+              </w:rPr>
+              <w:t>Dissanayake &amp; Johar (2021), Mehmood et al. (2021)</w:t>
+            </w:r>
+          </w:p>
+        </w:tc>
+        <w:tc>
+          <w:tcPr>
+            <w:tcW w:type="dxa" w:w="1440"/>
+            <w:shd w:fill="FFFFFF"/>
+          </w:tcPr>
+          <w:p>
+            <w:pPr>
+              <w:spacing w:after="40" w:before="40"/>
+            </w:pPr>
+            <w:r>
+              <w:rPr>
+                <w:rFonts w:ascii="Calibri" w:hAnsi="Calibri"/>
+                <w:sz w:val="19"/>
+              </w:rPr>
+              <w:t>4</w:t>
+            </w:r>
+          </w:p>
+        </w:tc>
+      </w:tr>
+      <w:tr>
+        <w:tc>
+          <w:tcPr>
+            <w:tcW w:type="dxa" w:w="1728"/>
+            <w:shd w:fill="F2F5F9"/>
+          </w:tcPr>
+          <w:p>
+            <w:pPr>
+              <w:spacing w:after="40" w:before="40"/>
+            </w:pPr>
+            <w:r>
+              <w:rPr>
+                <w:rFonts w:ascii="Calibri" w:hAnsi="Calibri"/>
+                <w:sz w:val="19"/>
+              </w:rPr>
+              <w:t>Sahitya</w:t>
+            </w:r>
+          </w:p>
+        </w:tc>
+        <w:tc>
+          <w:tcPr>
+            <w:tcW w:type="dxa" w:w="3600"/>
+            <w:shd w:fill="F2F5F9"/>
+          </w:tcPr>
+          <w:p>
+            <w:pPr>
+              <w:spacing w:after="40" w:before="40"/>
+            </w:pPr>
+            <w:r>
+              <w:rPr>
+                <w:rFonts w:ascii="Calibri" w:hAnsi="Calibri"/>
+                <w:sz w:val="19"/>
+              </w:rPr>
+              <w:t>Latha &amp; Jeeva (2019), Gokulnath &amp; Shantharajah (2019)</w:t>
+            </w:r>
+          </w:p>
+        </w:tc>
+        <w:tc>
+          <w:tcPr>
+            <w:tcW w:type="dxa" w:w="3600"/>
+            <w:shd w:fill="F2F5F9"/>
+          </w:tcPr>
+          <w:p>
+            <w:pPr>
+              <w:spacing w:after="40" w:before="40"/>
+            </w:pPr>
+            <w:r>
+              <w:rPr>
+                <w:rFonts w:ascii="Calibri" w:hAnsi="Calibri"/>
+                <w:sz w:val="19"/>
+              </w:rPr>
+              <w:t>Sarra et al. (2022), Al-Makhadmeh &amp; Tolba (2019)</w:t>
+            </w:r>
+          </w:p>
+        </w:tc>
+        <w:tc>
+          <w:tcPr>
+            <w:tcW w:type="dxa" w:w="1440"/>
+            <w:shd w:fill="F2F5F9"/>
+          </w:tcPr>
+          <w:p>
+            <w:pPr>
+              <w:spacing w:after="40" w:before="40"/>
+            </w:pPr>
+            <w:r>
+              <w:rPr>
+                <w:rFonts w:ascii="Calibri" w:hAnsi="Calibri"/>
+                <w:sz w:val="19"/>
+              </w:rPr>
+              <w:t>4</w:t>
+            </w:r>
+          </w:p>
+        </w:tc>
+      </w:tr>
+    </w:tbl>
+    <w:p>
+      <w:pPr>
+        <w:spacing w:before="0" w:after="120" w:line="276" w:lineRule="auto"/>
+      </w:pPr>
+      <w:r>
+        <w:rPr>
+          <w:rFonts w:ascii="Calibri" w:hAnsi="Calibri"/>
+          <w:sz w:val="22"/>
+        </w:rPr>
+        <w:t>Seven baseline classifiers were evaluated using 5-Fold Stratified Cross-Validation strictly on the 242 training rows, followed by evaluation on the 61 held-out test rows.</w:t>
       </w:r>
     </w:p>
     <w:p>

</xml_diff>